<commit_message>
docs(schedule): «동승» 을 매뉴얼 2.3 · 교육 자료 1.5 · TC 185행 · CLAUDE.md 에 반영
- 매뉴얼 8.6 「차량이 겹칠 때 · 함께 탈 때」 — 셋 중 고르는 창 · 대표 · 동승 풀기 · 메일 제목
- 교육 자료 5.2 같은 내용 요약
- TC +11 (적합 177 · 미수행 8) — 테스트 서버(:8092)에서 화면으로 눌러 확인한 것만
  함께 타기 창 · 경고 사라짐 · 대표 판정 · 묶음 밖 겹침 · 창의 함께 타기 · 동승 풀기 ·
  날짜 변경 시 해제 · 배차표/일 보기 표시 · 메일 제목 · 차량 거리 한 번만(760→860) ·
  하이패스 후보 대표 1명
- CLAUDE.md 일정 관리에 «동승» 절 · 마이그 039 두 DB 적용 기록
- 겹침 창 설명의 「따로 등록」 → 「따로」 — 붙여넣기 단추는 「따로 붙이기」 라 문구가 어긋났다

Co-Authored-By: Claude Opus 5 <noreply@anthropic.com>
</commit_message>
<xml_diff>
--- a/docs/manual/VITRON_ERP_직원교육자료.docx
+++ b/docs/manual/VITRON_ERP_직원교육자료.docx
@@ -53,7 +53,7 @@
           <w:color w:val="666666"/>
           <w:sz w:val="21"/>
         </w:rPr>
-        <w:t>문서 버전  1.4</w:t>
+        <w:t>문서 버전  1.5</w:t>
       </w:r>
     </w:p>
     <w:p>
@@ -67,7 +67,7 @@
           <w:color w:val="666666"/>
           <w:sz w:val="21"/>
         </w:rPr>
-        <w:t>작성일  2026-09-10</w:t>
+        <w:t>작성일  2026-09-14</w:t>
       </w:r>
     </w:p>
     <w:p>
@@ -316,7 +316,7 @@
           <w:rFonts w:ascii="맑은 고딕" w:hAnsi="맑은 고딕" w:eastAsia="맑은 고딕" w:cs="맑은 고딕"/>
           <w:sz w:val="19"/>
         </w:rPr>
-        <w:t xml:space="preserve">  5.1 차량 예약하기 · 5.2 차량이 겹칠 때</w:t>
+        <w:t xml:space="preserve">  5.1 차량 예약하기 · 5.2 차량이 겹칠 때 · 함께 탈 때</w:t>
       </w:r>
     </w:p>
     <w:p>
@@ -9528,7 +9528,7 @@
         <w:pStyle w:val="Heading2"/>
       </w:pPr>
       <w:r>
-        <w:t>5.2 차량이 겹칠 때</w:t>
+        <w:t>5.2 차량이 겹칠 때 · 함께 탈 때</w:t>
       </w:r>
     </w:p>
     <w:p>
@@ -9546,7 +9546,15 @@
           <w:b/>
           <w:sz w:val="21"/>
         </w:rPr>
-        <w:t>경고가 나옵니다.</w:t>
+        <w:t>셋 중 하나를 고르는 창</w:t>
+      </w:r>
+      <w:r>
+        <w:rPr>
+          <w:rFonts w:ascii="맑은 고딕" w:hAnsi="맑은 고딕" w:eastAsia="맑은 고딕" w:cs="맑은 고딕"/>
+          <w:b w:val="0"/>
+          <w:sz w:val="21"/>
+        </w:rPr>
+        <w:t>이 뜹니다.</w:t>
       </w:r>
     </w:p>
     <w:p>
@@ -9564,10 +9572,34 @@
       <w:r>
         <w:rPr>
           <w:rFonts w:ascii="맑은 고딕" w:hAnsi="맑은 고딕" w:eastAsia="맑은 고딕" w:cs="맑은 고딕"/>
+          <w:b/>
+          <w:sz w:val="21"/>
+        </w:rPr>
+        <w:t>함께 타기</w:t>
+      </w:r>
+      <w:r>
+        <w:rPr>
+          <w:rFonts w:ascii="맑은 고딕" w:hAnsi="맑은 고딕" w:eastAsia="맑은 고딕" w:cs="맑은 고딕"/>
           <w:b w:val="0"/>
           <w:sz w:val="21"/>
         </w:rPr>
-        <w:t>누가 · 어디로 · 어떤 시간대로 잡았는지 보여 줍니다</w:t>
+        <w:t xml:space="preserve"> — 한 차로 함께 갑니다. 겹침 경고가 사라지고 달력에 </w:t>
+      </w:r>
+      <w:r>
+        <w:rPr>
+          <w:rFonts w:ascii="맑은 고딕" w:hAnsi="맑은 고딕" w:eastAsia="맑은 고딕" w:cs="맑은 고딕"/>
+          <w:b/>
+          <w:sz w:val="21"/>
+        </w:rPr>
+        <w:t>👥</w:t>
+      </w:r>
+      <w:r>
+        <w:rPr>
+          <w:rFonts w:ascii="맑은 고딕" w:hAnsi="맑은 고딕" w:eastAsia="맑은 고딕" w:cs="맑은 고딕"/>
+          <w:b w:val="0"/>
+          <w:sz w:val="21"/>
+        </w:rPr>
+        <w:t xml:space="preserve"> 가 붙습니다</w:t>
       </w:r>
     </w:p>
     <w:p>
@@ -9585,18 +9617,18 @@
       <w:r>
         <w:rPr>
           <w:rFonts w:ascii="맑은 고딕" w:hAnsi="맑은 고딕" w:eastAsia="맑은 고딕" w:cs="맑은 고딕"/>
+          <w:b/>
+          <w:sz w:val="21"/>
+        </w:rPr>
+        <w:t>따로 등록</w:t>
+      </w:r>
+      <w:r>
+        <w:rPr>
+          <w:rFonts w:ascii="맑은 고딕" w:hAnsi="맑은 고딕" w:eastAsia="맑은 고딕" w:cs="맑은 고딕"/>
           <w:b w:val="0"/>
           <w:sz w:val="21"/>
         </w:rPr>
-        <w:t xml:space="preserve">종일과 오전은 겹치고, </w:t>
-      </w:r>
-      <w:r>
-        <w:rPr>
-          <w:rFonts w:ascii="맑은 고딕" w:hAnsi="맑은 고딕" w:eastAsia="맑은 고딕" w:cs="맑은 고딕"/>
-          <w:b/>
-          <w:sz w:val="21"/>
-        </w:rPr>
-        <w:t>오전과 오후는 겹치지 않습니다</w:t>
+        <w:t xml:space="preserve"> — 겹친 채로 등록합니다(다른 차를 구할 때까지 잡아 둘 때)</w:t>
       </w:r>
     </w:p>
     <w:p>
@@ -9617,7 +9649,7 @@
           <w:b/>
           <w:sz w:val="21"/>
         </w:rPr>
-        <w:t>막지는 않습니다</w:t>
+        <w:t>취소</w:t>
       </w:r>
       <w:r>
         <w:rPr>
@@ -9625,17 +9657,86 @@
           <w:b w:val="0"/>
           <w:sz w:val="21"/>
         </w:rPr>
-        <w:t xml:space="preserve"> — 같이 타고 가는 경우가 있기 때문입니다</w:t>
+        <w:t xml:space="preserve"> — 등록하지 않습니다</w:t>
       </w:r>
     </w:p>
     <w:p>
       <w:r>
         <w:rPr>
           <w:rFonts w:ascii="맑은 고딕" w:hAnsi="맑은 고딕" w:eastAsia="맑은 고딕" w:cs="맑은 고딕"/>
+          <w:b/>
+          <w:sz w:val="21"/>
+        </w:rPr>
+        <w:t>먼저 잡은 분이 대표</w:t>
+      </w:r>
+      <w:r>
+        <w:rPr>
+          <w:rFonts w:ascii="맑은 고딕" w:hAnsi="맑은 고딕" w:eastAsia="맑은 고딕" w:cs="맑은 고딕"/>
           <w:b w:val="0"/>
           <w:sz w:val="21"/>
         </w:rPr>
-        <w:t>경고가 나오면 먼저 예약한 분과 협의하시거나 다른 차량을 고르십시오.</w:t>
+        <w:t xml:space="preserve">이고, 차량 주행거리·하이패스는 대표 앞으로 셉니다. 이미 넣은 일정은 계획 창의 </w:t>
+      </w:r>
+      <w:r>
+        <w:rPr>
+          <w:rFonts w:ascii="맑은 고딕" w:hAnsi="맑은 고딕" w:eastAsia="맑은 고딕" w:cs="맑은 고딕"/>
+          <w:b/>
+          <w:sz w:val="21"/>
+        </w:rPr>
+        <w:t>[👥 함께 타기]</w:t>
+      </w:r>
+      <w:r>
+        <w:rPr>
+          <w:rFonts w:ascii="맑은 고딕" w:hAnsi="맑은 고딕" w:eastAsia="맑은 고딕" w:cs="맑은 고딕"/>
+          <w:b w:val="0"/>
+          <w:sz w:val="21"/>
+        </w:rPr>
+        <w:t xml:space="preserve"> / </w:t>
+      </w:r>
+      <w:r>
+        <w:rPr>
+          <w:rFonts w:ascii="맑은 고딕" w:hAnsi="맑은 고딕" w:eastAsia="맑은 고딕" w:cs="맑은 고딕"/>
+          <w:b/>
+          <w:sz w:val="21"/>
+        </w:rPr>
+        <w:t>[동승 풀기]</w:t>
+      </w:r>
+      <w:r>
+        <w:rPr>
+          <w:rFonts w:ascii="맑은 고딕" w:hAnsi="맑은 고딕" w:eastAsia="맑은 고딕" w:cs="맑은 고딕"/>
+          <w:b w:val="0"/>
+          <w:sz w:val="21"/>
+        </w:rPr>
+        <w:t xml:space="preserve"> 로 묶고 풉니다.</w:t>
+      </w:r>
+    </w:p>
+    <w:p>
+      <w:pPr>
+        <w:spacing w:after="60"/>
+        <w:ind w:left="340"/>
+      </w:pPr>
+      <w:r>
+        <w:rPr>
+          <w:rFonts w:ascii="맑은 고딕" w:hAnsi="맑은 고딕" w:eastAsia="맑은 고딕" w:cs="맑은 고딕"/>
+          <w:sz w:val="21"/>
+        </w:rPr>
+        <w:t xml:space="preserve">· </w:t>
+      </w:r>
+      <w:r>
+        <w:rPr>
+          <w:rFonts w:ascii="맑은 고딕" w:hAnsi="맑은 고딕" w:eastAsia="맑은 고딕" w:cs="맑은 고딕"/>
+          <w:b w:val="0"/>
+          <w:sz w:val="21"/>
+        </w:rPr>
+        <w:t xml:space="preserve">종일과 오전은 겹치고, </w:t>
+      </w:r>
+      <w:r>
+        <w:rPr>
+          <w:rFonts w:ascii="맑은 고딕" w:hAnsi="맑은 고딕" w:eastAsia="맑은 고딕" w:cs="맑은 고딕"/>
+          <w:b/>
+          <w:sz w:val="21"/>
+        </w:rPr>
+        <w:t>오전과 오후는 겹치지 않습니다</w:t>
       </w:r>
     </w:p>
     <w:p>

</xml_diff>